<commit_message>
Science - 9/30/2026 part 5
</commit_message>
<xml_diff>
--- a/1-Formal sciences/1-Mathematics/3-Pure Mathematics/3-Space/1-Geometry/5-My Source/2-Types of Orientation/2-Vertical Orientation.docx
+++ b/1-Formal sciences/1-Mathematics/3-Pure Mathematics/3-Space/1-Geometry/5-My Source/2-Types of Orientation/2-Vertical Orientation.docx
@@ -1,6 +1,6 @@
 
 <file path=word/document.xml><?xml version="1.0" encoding="utf-8"?>
-<w:document xmlns:wpc="http://schemas.microsoft.com/office/word/2010/wordprocessingCanvas" xmlns:cx="http://schemas.microsoft.com/office/drawing/2014/chartex" xmlns:cx1="http://schemas.microsoft.com/office/drawing/2015/9/8/chartex" xmlns:cx2="http://schemas.microsoft.com/office/drawing/2015/10/21/chartex" xmlns:cx3="http://schemas.microsoft.com/office/drawing/2016/5/9/chartex" xmlns:cx4="http://schemas.microsoft.com/office/drawing/2016/5/10/chartex" xmlns:cx5="http://schemas.microsoft.com/office/drawing/2016/5/11/chartex" xmlns:cx6="http://schemas.microsoft.com/office/drawing/2016/5/12/chartex" xmlns:cx7="http://schemas.microsoft.com/office/drawing/2016/5/13/chartex" xmlns:cx8="http://schemas.microsoft.com/office/drawing/2016/5/14/chartex" xmlns:mc="http://schemas.openxmlformats.org/markup-compatibility/2006" xmlns:aink="http://schemas.microsoft.com/office/drawing/2016/ink" xmlns:am3d="http://schemas.microsoft.com/office/drawing/2017/model3d" xmlns:o="urn:schemas-microsoft-com:office:office" xmlns:oel="http://schemas.microsoft.com/office/2019/extlst" xmlns:r="http://schemas.openxmlformats.org/officeDocument/2006/relationships" xmlns:m="http://schemas.openxmlformats.org/officeDocument/2006/math" xmlns:v="urn:schemas-microsoft-com:vml" xmlns:wp14="http://schemas.microsoft.com/office/word/2010/wordprocessingDrawing" xmlns:wp="http://schemas.openxmlformats.org/drawingml/2006/wordprocessingDrawing" xmlns:w10="urn:schemas-microsoft-com:office:word" xmlns:w="http://schemas.openxmlformats.org/wordprocessingml/2006/main" xmlns:w14="http://schemas.microsoft.com/office/word/2010/wordml" xmlns:w15="http://schemas.microsoft.com/office/word/2012/wordml" xmlns:w16cei="http://schemas.microsoft.com/office/word/2026/wordml/cei" xmlns:w16cex="http://schemas.microsoft.com/office/word/2018/wordml/cex" xmlns:w16cid="http://schemas.microsoft.com/office/word/2016/wordml/cid" xmlns:w16="http://schemas.microsoft.com/office/word/2018/wordml" xmlns:w16du="http://schemas.microsoft.com/office/word/2023/wordml/word16du" xmlns:w16sdtdh="http://schemas.microsoft.com/office/word/2020/wordml/sdtdatahash" xmlns:w16sdtfl="http://schemas.microsoft.com/office/word/2024/wordml/sdtformatlock" xmlns:w16se="http://schemas.microsoft.com/office/word/2015/wordml/symex" xmlns:wpg="http://schemas.microsoft.com/office/word/2010/wordprocessingGroup" xmlns:wpi="http://schemas.microsoft.com/office/word/2010/wordprocessingInk" xmlns:wne="http://schemas.microsoft.com/office/word/2006/wordml" xmlns:wps="http://schemas.microsoft.com/office/word/2010/wordprocessingShape" mc:Ignorable="w14 w15 w16se w16cid w16 w16cex w16sdtdh w16sdtfl w16du wp14">
+<w:document xmlns:wpc="http://schemas.microsoft.com/office/word/2010/wordprocessingCanvas" xmlns:cx="http://schemas.microsoft.com/office/drawing/2014/chartex" xmlns:cx1="http://schemas.microsoft.com/office/drawing/2015/9/8/chartex" xmlns:cx2="http://schemas.microsoft.com/office/drawing/2015/10/21/chartex" xmlns:cx3="http://schemas.microsoft.com/office/drawing/2016/5/9/chartex" xmlns:cx4="http://schemas.microsoft.com/office/drawing/2016/5/10/chartex" xmlns:cx5="http://schemas.microsoft.com/office/drawing/2016/5/11/chartex" xmlns:cx6="http://schemas.microsoft.com/office/drawing/2016/5/12/chartex" xmlns:cx7="http://schemas.microsoft.com/office/drawing/2016/5/13/chartex" xmlns:cx8="http://schemas.microsoft.com/office/drawing/2016/5/14/chartex" xmlns:mc="http://schemas.openxmlformats.org/markup-compatibility/2006" xmlns:aink="http://schemas.microsoft.com/office/drawing/2016/ink" xmlns:am3d="http://schemas.microsoft.com/office/drawing/2017/model3d" xmlns:o="urn:schemas-microsoft-com:office:office" xmlns:oel="http://schemas.microsoft.com/office/2019/extlst" xmlns:r="http://schemas.openxmlformats.org/officeDocument/2006/relationships" xmlns:m="http://schemas.openxmlformats.org/officeDocument/2006/math" xmlns:v="urn:schemas-microsoft-com:vml" xmlns:wp14="http://schemas.microsoft.com/office/word/2010/wordprocessingDrawing" xmlns:wp="http://schemas.openxmlformats.org/drawingml/2006/wordprocessingDrawing" xmlns:w10="urn:schemas-microsoft-com:office:word" xmlns:w="http://schemas.openxmlformats.org/wordprocessingml/2006/main" xmlns:w14="http://schemas.microsoft.com/office/word/2010/wordml" xmlns:w15="http://schemas.microsoft.com/office/word/2012/wordml" xmlns:w16cex="http://schemas.microsoft.com/office/word/2018/wordml/cex" xmlns:w16cid="http://schemas.microsoft.com/office/word/2016/wordml/cid" xmlns:w16="http://schemas.microsoft.com/office/word/2018/wordml" xmlns:w16du="http://schemas.microsoft.com/office/word/2023/wordml/word16du" xmlns:w16sdtdh="http://schemas.microsoft.com/office/word/2020/wordml/sdtdatahash" xmlns:w16sdtfl="http://schemas.microsoft.com/office/word/2024/wordml/sdtformatlock" xmlns:w16se="http://schemas.microsoft.com/office/word/2015/wordml/symex" xmlns:wpg="http://schemas.microsoft.com/office/word/2010/wordprocessingGroup" xmlns:wpi="http://schemas.microsoft.com/office/word/2010/wordprocessingInk" xmlns:wne="http://schemas.microsoft.com/office/word/2006/wordml" xmlns:wps="http://schemas.microsoft.com/office/word/2010/wordprocessingShape" mc:Ignorable="w14 w15 w16se w16cid w16 w16cex w16sdtdh w16sdtfl w16du wp14">
   <w:body>
     <w:p>
       <w:pPr>
@@ -36,7 +36,27 @@
           <w:sz w:val="18"/>
           <w:highlight w:val="lightGray"/>
         </w:rPr>
-        <w:t xml:space="preserve">: Persons Table -&gt; ID Column: 1, Name_En Column: Motasem Essam] -&gt; </w:t>
+        <w:t xml:space="preserve">: Persons Table -&gt; ID Column: 1, </w:t>
+      </w:r>
+      <w:proofErr w:type="spellStart"/>
+      <w:r>
+        <w:rPr>
+          <w:rFonts w:ascii="Arial" w:eastAsia="Arial" w:hAnsi="Arial" w:cs="Arial"/>
+          <w:color w:val="000000"/>
+          <w:sz w:val="18"/>
+          <w:highlight w:val="lightGray"/>
+        </w:rPr>
+        <w:t>Name_En</w:t>
+      </w:r>
+      <w:proofErr w:type="spellEnd"/>
+      <w:r>
+        <w:rPr>
+          <w:rFonts w:ascii="Arial" w:eastAsia="Arial" w:hAnsi="Arial" w:cs="Arial"/>
+          <w:color w:val="000000"/>
+          <w:sz w:val="18"/>
+          <w:highlight w:val="lightGray"/>
+        </w:rPr>
+        <w:t xml:space="preserve"> Column: Motasem Essam] -&gt; </w:t>
       </w:r>
       <w:r>
         <w:rPr>
@@ -220,7 +240,27 @@
           <w:sz w:val="18"/>
           <w:highlight w:val="lightGray"/>
         </w:rPr>
-        <w:t xml:space="preserve">: Persons Table -&gt; ID Column: 1, Name_En Column: Motasem Essam] -&gt; </w:t>
+        <w:t xml:space="preserve">: Persons Table -&gt; ID Column: 1, </w:t>
+      </w:r>
+      <w:proofErr w:type="spellStart"/>
+      <w:r>
+        <w:rPr>
+          <w:rFonts w:ascii="Arial" w:eastAsia="Arial" w:hAnsi="Arial" w:cs="Arial"/>
+          <w:color w:val="000000"/>
+          <w:sz w:val="18"/>
+          <w:highlight w:val="lightGray"/>
+        </w:rPr>
+        <w:t>Name_En</w:t>
+      </w:r>
+      <w:proofErr w:type="spellEnd"/>
+      <w:r>
+        <w:rPr>
+          <w:rFonts w:ascii="Arial" w:eastAsia="Arial" w:hAnsi="Arial" w:cs="Arial"/>
+          <w:color w:val="000000"/>
+          <w:sz w:val="18"/>
+          <w:highlight w:val="lightGray"/>
+        </w:rPr>
+        <w:t xml:space="preserve"> Column: Motasem Essam] -&gt; </w:t>
       </w:r>
       <w:r>
         <w:rPr>
@@ -453,7 +493,27 @@
           <w:sz w:val="18"/>
           <w:highlight w:val="lightGray"/>
         </w:rPr>
-        <w:t xml:space="preserve">: Persons Table -&gt; ID Column: 1, Name_En Column: Motasem Essam] -&gt; </w:t>
+        <w:t xml:space="preserve">: Persons Table -&gt; ID Column: 1, </w:t>
+      </w:r>
+      <w:proofErr w:type="spellStart"/>
+      <w:r>
+        <w:rPr>
+          <w:rFonts w:ascii="Arial" w:eastAsia="Arial" w:hAnsi="Arial" w:cs="Arial"/>
+          <w:color w:val="000000"/>
+          <w:sz w:val="18"/>
+          <w:highlight w:val="lightGray"/>
+        </w:rPr>
+        <w:t>Name_En</w:t>
+      </w:r>
+      <w:proofErr w:type="spellEnd"/>
+      <w:r>
+        <w:rPr>
+          <w:rFonts w:ascii="Arial" w:eastAsia="Arial" w:hAnsi="Arial" w:cs="Arial"/>
+          <w:color w:val="000000"/>
+          <w:sz w:val="18"/>
+          <w:highlight w:val="lightGray"/>
+        </w:rPr>
+        <w:t xml:space="preserve"> Column: Motasem Essam] -&gt; </w:t>
       </w:r>
       <w:r>
         <w:rPr>
@@ -663,7 +723,27 @@
           <w:sz w:val="18"/>
           <w:highlight w:val="lightGray"/>
         </w:rPr>
-        <w:t xml:space="preserve">: Persons Table -&gt; ID Column: 1, Name_En Column: Motasem Essam] -&gt; </w:t>
+        <w:t xml:space="preserve">: Persons Table -&gt; ID Column: 1, </w:t>
+      </w:r>
+      <w:proofErr w:type="spellStart"/>
+      <w:r>
+        <w:rPr>
+          <w:rFonts w:ascii="Arial" w:eastAsia="Arial" w:hAnsi="Arial" w:cs="Arial"/>
+          <w:color w:val="000000"/>
+          <w:sz w:val="18"/>
+          <w:highlight w:val="lightGray"/>
+        </w:rPr>
+        <w:t>Name_En</w:t>
+      </w:r>
+      <w:proofErr w:type="spellEnd"/>
+      <w:r>
+        <w:rPr>
+          <w:rFonts w:ascii="Arial" w:eastAsia="Arial" w:hAnsi="Arial" w:cs="Arial"/>
+          <w:color w:val="000000"/>
+          <w:sz w:val="18"/>
+          <w:highlight w:val="lightGray"/>
+        </w:rPr>
+        <w:t xml:space="preserve"> Column: Motasem Essam] -&gt; </w:t>
       </w:r>
       <w:r>
         <w:rPr>
@@ -801,7 +881,6 @@
           <m:r>
             <w:rPr>
               <w:rFonts w:ascii="Roboto Mono" w:hAnsi="Roboto Mono"/>
-              <w:i/>
               <w:sz w:val="24"/>
               <w:szCs w:val="24"/>
             </w:rPr>
@@ -849,6 +928,14 @@
           <m:t>c</m:t>
         </m:r>
       </m:oMath>
+      <w:r>
+        <w:rPr>
+          <w:rFonts w:ascii="Roboto Mono" w:eastAsiaTheme="minorEastAsia" w:hAnsi="Roboto Mono"/>
+          <w:sz w:val="24"/>
+          <w:szCs w:val="24"/>
+        </w:rPr>
+        <w:t xml:space="preserve"> </w:t>
+      </w:r>
       <w:r>
         <w:rPr>
           <w:rFonts w:ascii="Roboto Mono" w:hAnsi="Roboto Mono"/>
@@ -896,7 +983,6 @@
           <m:r>
             <w:rPr>
               <w:rFonts w:ascii="Roboto Mono" w:hAnsi="Roboto Mono"/>
-              <w:i/>
               <w:sz w:val="24"/>
               <w:szCs w:val="24"/>
             </w:rPr>
@@ -919,7 +1005,7 @@
           <w:szCs w:val="24"/>
         </w:rPr>
         <w:pict w14:anchorId="5D2AC96B">
-          <v:rect id="_x0000_i1048" style="width:0;height:1.5pt" o:hralign="center" o:hrstd="t" o:hr="t" fillcolor="#a0a0a0" stroked="f"/>
+          <v:rect id="_x0000_i1028" style="width:0;height:1.5pt" o:hralign="center" o:hrstd="t" o:hr="t" fillcolor="#a0a0a0" stroked="f"/>
         </w:pict>
       </w:r>
     </w:p>
@@ -949,7 +1035,27 @@
           <w:sz w:val="18"/>
           <w:highlight w:val="lightGray"/>
         </w:rPr>
-        <w:t xml:space="preserve">: Persons Table -&gt; ID Column: 1, Name_En Column: Motasem Essam] -&gt; </w:t>
+        <w:t xml:space="preserve">: Persons Table -&gt; ID Column: 1, </w:t>
+      </w:r>
+      <w:proofErr w:type="spellStart"/>
+      <w:r>
+        <w:rPr>
+          <w:rFonts w:ascii="Arial" w:eastAsia="Arial" w:hAnsi="Arial" w:cs="Arial"/>
+          <w:color w:val="000000"/>
+          <w:sz w:val="18"/>
+          <w:highlight w:val="lightGray"/>
+        </w:rPr>
+        <w:t>Name_En</w:t>
+      </w:r>
+      <w:proofErr w:type="spellEnd"/>
+      <w:r>
+        <w:rPr>
+          <w:rFonts w:ascii="Arial" w:eastAsia="Arial" w:hAnsi="Arial" w:cs="Arial"/>
+          <w:color w:val="000000"/>
+          <w:sz w:val="18"/>
+          <w:highlight w:val="lightGray"/>
+        </w:rPr>
+        <w:t xml:space="preserve"> Column: Motasem Essam] -&gt; </w:t>
       </w:r>
       <w:r>
         <w:rPr>
@@ -1200,7 +1306,27 @@
           <w:sz w:val="18"/>
           <w:highlight w:val="lightGray"/>
         </w:rPr>
-        <w:t xml:space="preserve">: Persons Table -&gt; ID Column: 1, Name_En Column: Motasem Essam] -&gt; </w:t>
+        <w:t xml:space="preserve">: Persons Table -&gt; ID Column: 1, </w:t>
+      </w:r>
+      <w:proofErr w:type="spellStart"/>
+      <w:r>
+        <w:rPr>
+          <w:rFonts w:ascii="Arial" w:eastAsia="Arial" w:hAnsi="Arial" w:cs="Arial"/>
+          <w:color w:val="000000"/>
+          <w:sz w:val="18"/>
+          <w:highlight w:val="lightGray"/>
+        </w:rPr>
+        <w:t>Name_En</w:t>
+      </w:r>
+      <w:proofErr w:type="spellEnd"/>
+      <w:r>
+        <w:rPr>
+          <w:rFonts w:ascii="Arial" w:eastAsia="Arial" w:hAnsi="Arial" w:cs="Arial"/>
+          <w:color w:val="000000"/>
+          <w:sz w:val="18"/>
+          <w:highlight w:val="lightGray"/>
+        </w:rPr>
+        <w:t xml:space="preserve"> Column: Motasem Essam] -&gt; </w:t>
       </w:r>
       <w:r>
         <w:rPr>
@@ -1621,7 +1747,27 @@
           <w:sz w:val="18"/>
           <w:highlight w:val="lightGray"/>
         </w:rPr>
-        <w:t xml:space="preserve">: Persons Table -&gt; ID Column: 1, Name_En Column: Motasem Essam] -&gt; </w:t>
+        <w:t xml:space="preserve">: Persons Table -&gt; ID Column: 1, </w:t>
+      </w:r>
+      <w:proofErr w:type="spellStart"/>
+      <w:r>
+        <w:rPr>
+          <w:rFonts w:ascii="Arial" w:eastAsia="Arial" w:hAnsi="Arial" w:cs="Arial"/>
+          <w:color w:val="000000"/>
+          <w:sz w:val="18"/>
+          <w:highlight w:val="lightGray"/>
+        </w:rPr>
+        <w:t>Name_En</w:t>
+      </w:r>
+      <w:proofErr w:type="spellEnd"/>
+      <w:r>
+        <w:rPr>
+          <w:rFonts w:ascii="Arial" w:eastAsia="Arial" w:hAnsi="Arial" w:cs="Arial"/>
+          <w:color w:val="000000"/>
+          <w:sz w:val="18"/>
+          <w:highlight w:val="lightGray"/>
+        </w:rPr>
+        <w:t xml:space="preserve"> Column: Motasem Essam] -&gt; </w:t>
       </w:r>
       <w:r>
         <w:rPr>
@@ -1935,7 +2081,27 @@
           <w:sz w:val="18"/>
           <w:highlight w:val="lightGray"/>
         </w:rPr>
-        <w:t xml:space="preserve">: Persons Table -&gt; ID Column: 1, Name_En Column: Motasem Essam] -&gt; </w:t>
+        <w:t xml:space="preserve">: Persons Table -&gt; ID Column: 1, </w:t>
+      </w:r>
+      <w:proofErr w:type="spellStart"/>
+      <w:r>
+        <w:rPr>
+          <w:rFonts w:ascii="Arial" w:eastAsia="Arial" w:hAnsi="Arial" w:cs="Arial"/>
+          <w:color w:val="000000"/>
+          <w:sz w:val="18"/>
+          <w:highlight w:val="lightGray"/>
+        </w:rPr>
+        <w:t>Name_En</w:t>
+      </w:r>
+      <w:proofErr w:type="spellEnd"/>
+      <w:r>
+        <w:rPr>
+          <w:rFonts w:ascii="Arial" w:eastAsia="Arial" w:hAnsi="Arial" w:cs="Arial"/>
+          <w:color w:val="000000"/>
+          <w:sz w:val="18"/>
+          <w:highlight w:val="lightGray"/>
+        </w:rPr>
+        <w:t xml:space="preserve"> Column: Motasem Essam] -&gt; </w:t>
       </w:r>
       <w:r>
         <w:rPr>
@@ -2143,7 +2309,27 @@
           <w:sz w:val="18"/>
           <w:highlight w:val="lightGray"/>
         </w:rPr>
-        <w:t xml:space="preserve">: Persons Table -&gt; ID Column: 1, Name_En Column: Motasem Essam] -&gt; </w:t>
+        <w:t xml:space="preserve">: Persons Table -&gt; ID Column: 1, </w:t>
+      </w:r>
+      <w:proofErr w:type="spellStart"/>
+      <w:r>
+        <w:rPr>
+          <w:rFonts w:ascii="Arial" w:eastAsia="Arial" w:hAnsi="Arial" w:cs="Arial"/>
+          <w:color w:val="000000"/>
+          <w:sz w:val="18"/>
+          <w:highlight w:val="lightGray"/>
+        </w:rPr>
+        <w:t>Name_En</w:t>
+      </w:r>
+      <w:proofErr w:type="spellEnd"/>
+      <w:r>
+        <w:rPr>
+          <w:rFonts w:ascii="Arial" w:eastAsia="Arial" w:hAnsi="Arial" w:cs="Arial"/>
+          <w:color w:val="000000"/>
+          <w:sz w:val="18"/>
+          <w:highlight w:val="lightGray"/>
+        </w:rPr>
+        <w:t xml:space="preserve"> Column: Motasem Essam] -&gt; </w:t>
       </w:r>
       <w:r>
         <w:rPr>
@@ -2295,7 +2481,27 @@
           <w:sz w:val="18"/>
           <w:highlight w:val="lightGray"/>
         </w:rPr>
-        <w:t xml:space="preserve">: Persons Table -&gt; ID Column: 1, Name_En Column: Motasem Essam] -&gt; </w:t>
+        <w:t xml:space="preserve">: Persons Table -&gt; ID Column: 1, </w:t>
+      </w:r>
+      <w:proofErr w:type="spellStart"/>
+      <w:r>
+        <w:rPr>
+          <w:rFonts w:ascii="Arial" w:eastAsia="Arial" w:hAnsi="Arial" w:cs="Arial"/>
+          <w:color w:val="000000"/>
+          <w:sz w:val="18"/>
+          <w:highlight w:val="lightGray"/>
+        </w:rPr>
+        <w:t>Name_En</w:t>
+      </w:r>
+      <w:proofErr w:type="spellEnd"/>
+      <w:r>
+        <w:rPr>
+          <w:rFonts w:ascii="Arial" w:eastAsia="Arial" w:hAnsi="Arial" w:cs="Arial"/>
+          <w:color w:val="000000"/>
+          <w:sz w:val="18"/>
+          <w:highlight w:val="lightGray"/>
+        </w:rPr>
+        <w:t xml:space="preserve"> Column: Motasem Essam] -&gt; </w:t>
       </w:r>
       <w:r>
         <w:rPr>
@@ -2681,7 +2887,27 @@
           <w:sz w:val="18"/>
           <w:highlight w:val="lightGray"/>
         </w:rPr>
-        <w:t xml:space="preserve">: Persons Table -&gt; ID Column: 1, Name_En Column: Motasem Essam] -&gt; </w:t>
+        <w:t xml:space="preserve">: Persons Table -&gt; ID Column: 1, </w:t>
+      </w:r>
+      <w:proofErr w:type="spellStart"/>
+      <w:r>
+        <w:rPr>
+          <w:rFonts w:ascii="Arial" w:eastAsia="Arial" w:hAnsi="Arial" w:cs="Arial"/>
+          <w:color w:val="000000"/>
+          <w:sz w:val="18"/>
+          <w:highlight w:val="lightGray"/>
+        </w:rPr>
+        <w:t>Name_En</w:t>
+      </w:r>
+      <w:proofErr w:type="spellEnd"/>
+      <w:r>
+        <w:rPr>
+          <w:rFonts w:ascii="Arial" w:eastAsia="Arial" w:hAnsi="Arial" w:cs="Arial"/>
+          <w:color w:val="000000"/>
+          <w:sz w:val="18"/>
+          <w:highlight w:val="lightGray"/>
+        </w:rPr>
+        <w:t xml:space="preserve"> Column: Motasem Essam] -&gt; </w:t>
       </w:r>
       <w:r>
         <w:rPr>
@@ -2921,7 +3147,27 @@
           <w:sz w:val="18"/>
           <w:highlight w:val="lightGray"/>
         </w:rPr>
-        <w:t xml:space="preserve">: Persons Table -&gt; ID Column: 1, Name_En Column: Motasem Essam] -&gt; </w:t>
+        <w:t xml:space="preserve">: Persons Table -&gt; ID Column: 1, </w:t>
+      </w:r>
+      <w:proofErr w:type="spellStart"/>
+      <w:r>
+        <w:rPr>
+          <w:rFonts w:ascii="Arial" w:eastAsia="Arial" w:hAnsi="Arial" w:cs="Arial"/>
+          <w:color w:val="000000"/>
+          <w:sz w:val="18"/>
+          <w:highlight w:val="lightGray"/>
+        </w:rPr>
+        <w:t>Name_En</w:t>
+      </w:r>
+      <w:proofErr w:type="spellEnd"/>
+      <w:r>
+        <w:rPr>
+          <w:rFonts w:ascii="Arial" w:eastAsia="Arial" w:hAnsi="Arial" w:cs="Arial"/>
+          <w:color w:val="000000"/>
+          <w:sz w:val="18"/>
+          <w:highlight w:val="lightGray"/>
+        </w:rPr>
+        <w:t xml:space="preserve"> Column: Motasem Essam] -&gt; </w:t>
       </w:r>
       <w:r>
         <w:rPr>
@@ -3027,7 +3273,7 @@
 </file>
 
 <file path=word/numbering.xml><?xml version="1.0" encoding="utf-8"?>
-<w:numbering xmlns:wpc="http://schemas.microsoft.com/office/word/2010/wordprocessingCanvas" xmlns:cx="http://schemas.microsoft.com/office/drawing/2014/chartex" xmlns:cx1="http://schemas.microsoft.com/office/drawing/2015/9/8/chartex" xmlns:cx2="http://schemas.microsoft.com/office/drawing/2015/10/21/chartex" xmlns:cx3="http://schemas.microsoft.com/office/drawing/2016/5/9/chartex" xmlns:cx4="http://schemas.microsoft.com/office/drawing/2016/5/10/chartex" xmlns:cx5="http://schemas.microsoft.com/office/drawing/2016/5/11/chartex" xmlns:cx6="http://schemas.microsoft.com/office/drawing/2016/5/12/chartex" xmlns:cx7="http://schemas.microsoft.com/office/drawing/2016/5/13/chartex" xmlns:cx8="http://schemas.microsoft.com/office/drawing/2016/5/14/chartex" xmlns:mc="http://schemas.openxmlformats.org/markup-compatibility/2006" xmlns:aink="http://schemas.microsoft.com/office/drawing/2016/ink" xmlns:am3d="http://schemas.microsoft.com/office/drawing/2017/model3d" xmlns:o="urn:schemas-microsoft-com:office:office" xmlns:oel="http://schemas.microsoft.com/office/2019/extlst" xmlns:r="http://schemas.openxmlformats.org/officeDocument/2006/relationships" xmlns:m="http://schemas.openxmlformats.org/officeDocument/2006/math" xmlns:v="urn:schemas-microsoft-com:vml" xmlns:wp14="http://schemas.microsoft.com/office/word/2010/wordprocessingDrawing" xmlns:wp="http://schemas.openxmlformats.org/drawingml/2006/wordprocessingDrawing" xmlns:w10="urn:schemas-microsoft-com:office:word" xmlns:w="http://schemas.openxmlformats.org/wordprocessingml/2006/main" xmlns:w14="http://schemas.microsoft.com/office/word/2010/wordml" xmlns:w15="http://schemas.microsoft.com/office/word/2012/wordml" xmlns:w16cei="http://schemas.microsoft.com/office/word/2026/wordml/cei" xmlns:w16cex="http://schemas.microsoft.com/office/word/2018/wordml/cex" xmlns:w16cid="http://schemas.microsoft.com/office/word/2016/wordml/cid" xmlns:w16="http://schemas.microsoft.com/office/word/2018/wordml" xmlns:w16du="http://schemas.microsoft.com/office/word/2023/wordml/word16du" xmlns:w16sdtdh="http://schemas.microsoft.com/office/word/2020/wordml/sdtdatahash" xmlns:w16sdtfl="http://schemas.microsoft.com/office/word/2024/wordml/sdtformatlock" xmlns:w16se="http://schemas.microsoft.com/office/word/2015/wordml/symex" xmlns:wpg="http://schemas.microsoft.com/office/word/2010/wordprocessingGroup" xmlns:wpi="http://schemas.microsoft.com/office/word/2010/wordprocessingInk" xmlns:wne="http://schemas.microsoft.com/office/word/2006/wordml" xmlns:wps="http://schemas.microsoft.com/office/word/2010/wordprocessingShape" mc:Ignorable="w14 w15 w16se w16cid w16 w16cex w16sdtdh w16sdtfl w16du wp14">
+<w:numbering xmlns:wpc="http://schemas.microsoft.com/office/word/2010/wordprocessingCanvas" xmlns:cx="http://schemas.microsoft.com/office/drawing/2014/chartex" xmlns:cx1="http://schemas.microsoft.com/office/drawing/2015/9/8/chartex" xmlns:cx2="http://schemas.microsoft.com/office/drawing/2015/10/21/chartex" xmlns:cx3="http://schemas.microsoft.com/office/drawing/2016/5/9/chartex" xmlns:cx4="http://schemas.microsoft.com/office/drawing/2016/5/10/chartex" xmlns:cx5="http://schemas.microsoft.com/office/drawing/2016/5/11/chartex" xmlns:cx6="http://schemas.microsoft.com/office/drawing/2016/5/12/chartex" xmlns:cx7="http://schemas.microsoft.com/office/drawing/2016/5/13/chartex" xmlns:cx8="http://schemas.microsoft.com/office/drawing/2016/5/14/chartex" xmlns:mc="http://schemas.openxmlformats.org/markup-compatibility/2006" xmlns:aink="http://schemas.microsoft.com/office/drawing/2016/ink" xmlns:am3d="http://schemas.microsoft.com/office/drawing/2017/model3d" xmlns:o="urn:schemas-microsoft-com:office:office" xmlns:oel="http://schemas.microsoft.com/office/2019/extlst" xmlns:r="http://schemas.openxmlformats.org/officeDocument/2006/relationships" xmlns:m="http://schemas.openxmlformats.org/officeDocument/2006/math" xmlns:v="urn:schemas-microsoft-com:vml" xmlns:wp14="http://schemas.microsoft.com/office/word/2010/wordprocessingDrawing" xmlns:wp="http://schemas.openxmlformats.org/drawingml/2006/wordprocessingDrawing" xmlns:w10="urn:schemas-microsoft-com:office:word" xmlns:w="http://schemas.openxmlformats.org/wordprocessingml/2006/main" xmlns:w14="http://schemas.microsoft.com/office/word/2010/wordml" xmlns:w15="http://schemas.microsoft.com/office/word/2012/wordml" xmlns:w16cex="http://schemas.microsoft.com/office/word/2018/wordml/cex" xmlns:w16cid="http://schemas.microsoft.com/office/word/2016/wordml/cid" xmlns:w16="http://schemas.microsoft.com/office/word/2018/wordml" xmlns:w16du="http://schemas.microsoft.com/office/word/2023/wordml/word16du" xmlns:w16sdtdh="http://schemas.microsoft.com/office/word/2020/wordml/sdtdatahash" xmlns:w16sdtfl="http://schemas.microsoft.com/office/word/2024/wordml/sdtformatlock" xmlns:w16se="http://schemas.microsoft.com/office/word/2015/wordml/symex" xmlns:wpg="http://schemas.microsoft.com/office/word/2010/wordprocessingGroup" xmlns:wpi="http://schemas.microsoft.com/office/word/2010/wordprocessingInk" xmlns:wne="http://schemas.microsoft.com/office/word/2006/wordml" xmlns:wps="http://schemas.microsoft.com/office/word/2010/wordprocessingShape" mc:Ignorable="w14 w15 w16se w16cid w16 w16cex w16sdtdh w16sdtfl w16du wp14">
   <w:abstractNum w:abstractNumId="0" w15:restartNumberingAfterBreak="0">
     <w:nsid w:val="023420E5"/>
     <w:multiLevelType w:val="multilevel"/>
@@ -5148,6 +5394,7 @@
   <w:style w:type="character" w:default="1" w:styleId="DefaultParagraphFont">
     <w:name w:val="Default Paragraph Font"/>
     <w:uiPriority w:val="1"/>
+    <w:semiHidden/>
     <w:unhideWhenUsed/>
   </w:style>
   <w:style w:type="table" w:default="1" w:styleId="TableNormal">

</xml_diff>